<commit_message>
Fix: Arreglar error en la documentacion
</commit_message>
<xml_diff>
--- a/Taller 2 - Integrantes.docx
+++ b/Taller 2 - Integrantes.docx
@@ -19,7 +19,16 @@
           <w:sz w:val="144"/>
           <w:szCs w:val="144"/>
         </w:rPr>
-        <w:t>Taller 1</w:t>
+        <w:t xml:space="preserve">Taller </w:t>
+      </w:r>
+      <w:r>
+        <w:rPr>
+          <w:b/>
+          <w:bCs/>
+          <w:sz w:val="144"/>
+          <w:szCs w:val="144"/>
+        </w:rPr>
+        <w:t>2</w:t>
       </w:r>
     </w:p>
     <w:p>

</xml_diff>